<commit_message>
docs(scrum): correct template header clipping and refresh final PDFs
</commit_message>
<xml_diff>
--- a/Retos_M5/Semana4_SCRUM/documentos/UCAMP_SCRUM_Semana2_Mochi_Monchi.docx
+++ b/Retos_M5/Semana4_SCRUM/documentos/UCAMP_SCRUM_Semana2_Mochi_Monchi.docx
@@ -3161,7 +3161,7 @@
                             </w:pPr>
                             <w:r>
                               <w:rPr>
-                                <w:rFonts w:ascii="Sora" w:cs="Sora" w:eastAsia="Sora" w:hAnsi="Sora"/>
+                                <w:rFonts w:ascii="Arial" w:cs="Arial" w:eastAsia="Arial" w:hAnsi="Arial"/>
                                 <w:b w:val="0"/>
                                 <w:i w:val="0"/>
                                 <w:smallCaps w:val="0"/>
@@ -3175,7 +3175,7 @@
                           </w:p>
                         </w:txbxContent>
                       </wps:txbx>
-                      <wps:bodyPr anchorCtr="0" anchor="t" bIns="91425" lIns="91425" spcFirstLastPara="1" rIns="91425" wrap="square" tIns="91425">
+                      <wps:bodyPr anchorCtr="0" anchor="t" bIns="0" lIns="91425" spcFirstLastPara="1" rIns="91425" wrap="square" tIns="0">
                         <a:noAutofit/>
                       </wps:bodyPr>
                     </wps:wsp>
@@ -3206,7 +3206,7 @@
                             </w:pPr>
                             <w:r>
                               <w:rPr>
-                                <w:rFonts w:ascii="Sora" w:cs="Sora" w:eastAsia="Sora" w:hAnsi="Sora"/>
+                                <w:rFonts w:ascii="Arial" w:cs="Arial" w:eastAsia="Arial" w:hAnsi="Arial"/>
                                 <w:b w:val="1"/>
                                 <w:i w:val="0"/>
                                 <w:smallCaps w:val="0"/>
@@ -3220,7 +3220,7 @@
                           </w:p>
                         </w:txbxContent>
                       </wps:txbx>
-                      <wps:bodyPr anchorCtr="0" anchor="t" bIns="91425" lIns="91425" spcFirstLastPara="1" rIns="91425" wrap="square" tIns="91425">
+                      <wps:bodyPr anchorCtr="0" anchor="t" bIns="0" lIns="91425" spcFirstLastPara="1" rIns="91425" wrap="square" tIns="0">
                         <a:noAutofit/>
                       </wps:bodyPr>
                     </wps:wsp>

</xml_diff>